<commit_message>
fix: correct paper reference types
</commit_message>
<xml_diff>
--- a/reports/基于MAF的多智能体私有信息披露机制复现与对比研究_2026-08-05.docx
+++ b/reports/基于MAF的多智能体私有信息披露机制复现与对比研究_2026-08-05.docx
@@ -7495,7 +7495,7 @@
           <w:i w:val="0"/>
           <w:sz w:val="18"/>
         </w:rPr>
-        <w:t>[3] Li Lu, Y. Connie Yuan, and Poppy Lauretta McLeod. Twenty-Five Years of Hidden Profiles in Group Decision Making: A Meta-Analysis [EB/OL]. Personality and Social Psychology Review, 16(1), 54-75, 2012. doi:10.1177/1088868311417243. https://doi.org/10.1177/1088868311417243</w:t>
+        <w:t>[3] Li Lu, Y. Connie Yuan, and Poppy Lauretta McLeod. Twenty-Five Years of Hidden Profiles in Group Decision Making: A Meta-Analysis [J]. Personality and Social Psychology Review, 16(1), 54-75, 2012. doi:10.1177/1088868311417243. https://doi.org/10.1177/1088868311417243</w:t>
       </w:r>
     </w:p>
     <w:p>
@@ -7615,7 +7615,7 @@
           <w:i w:val="0"/>
           <w:sz w:val="18"/>
         </w:rPr>
-        <w:t>[11] Mert Cemri, Melissa Z. Pan, Shuyi Yang, Lakshya A. Agrawal, Bhavya Chopra, Rishabh Tiwari, Kurt Keutzer, Aditya Parameswaran, Dan Klein, Kannan Ramchandran, Matei Zaharia, Joseph E. Gonzalez, and Ion Stoica. Why Do Multi-Agent LLM Systems Fail? [EB/OL]. Advances in Neural Information Processing Systems (NeurIPS), 2025. arXiv:2503.13657. https://arxiv.org/abs/2503.13657</w:t>
+        <w:t>[11] Mert Cemri, Melissa Z. Pan, Shuyi Yang, Lakshya A. Agrawal, Bhavya Chopra, Rishabh Tiwari, Kurt Keutzer, Aditya Parameswaran, Dan Klein, Kannan Ramchandran, Matei Zaharia, Joseph E. Gonzalez, and Ion Stoica. Why Do Multi-Agent LLM Systems Fail? [C]. Advances in Neural Information Processing Systems (NeurIPS), 2025. arXiv:2503.13657. https://arxiv.org/abs/2503.13657</w:t>
       </w:r>
     </w:p>
     <w:p>

</xml_diff>